<commit_message>
Parandatud dokumentatsioon ja kokkuvõte
</commit_message>
<xml_diff>
--- a/Dokumentatsioon ja kokkuvõte.docx
+++ b/Dokumentatsioon ja kokkuvõte.docx
@@ -544,10 +544,13 @@
           <w:bCs/>
         </w:rPr>
         <w:lastRenderedPageBreak/>
-        <w:t>Python</w:t>
-      </w:r>
-      <w:r>
-        <w:t>: Andmetöötluseks ja mudelite defineerimiseks, samuti päringute ja andmete kuvamise loogika rakendamiseks.</w:t>
+        <w:t>Redis NoSQL</w:t>
+      </w:r>
+      <w:r>
+        <w:t>:</w:t>
+      </w:r>
+      <w:r>
+        <w:t xml:space="preserve"> Cache (vahemälu) salvestamiseks kiiremaks veebi sirvimiseks ja vältimaks liigsete päringute loomist andmebaasis vähendades sellega viimase koormust.</w:t>
       </w:r>
     </w:p>
     <w:p>
@@ -562,10 +565,10 @@
           <w:b/>
           <w:bCs/>
         </w:rPr>
-        <w:t>pgAdmin</w:t>
-      </w:r>
-      <w:r>
-        <w:t>: Andmebaasi haldamiseks ja testimiseks.</w:t>
+        <w:t>Python</w:t>
+      </w:r>
+      <w:r>
+        <w:t>: Andmetöötluseks ja mudelite defineerimiseks, samuti päringute ja andmete kuvamise loogika rakendamiseks.</w:t>
       </w:r>
     </w:p>
     <w:p>
@@ -580,10 +583,10 @@
           <w:b/>
           <w:bCs/>
         </w:rPr>
-        <w:t>ChatGPT</w:t>
-      </w:r>
-      <w:r>
-        <w:t>: Abi saamiseks keerulisemate andmebaasi- ja koodiprobleemide lahendamisel ning juhiste ja nõuannete saamiseks.</w:t>
+        <w:t>pgAdmin</w:t>
+      </w:r>
+      <w:r>
+        <w:t>: Andmebaasi haldamiseks ja testimiseks.</w:t>
       </w:r>
     </w:p>
     <w:p>
@@ -598,13 +601,10 @@
           <w:b/>
           <w:bCs/>
         </w:rPr>
-        <w:t>Javascript, HTML ja CSS</w:t>
-      </w:r>
-      <w:r>
-        <w:t>:</w:t>
-      </w:r>
-      <w:r>
-        <w:t xml:space="preserve"> Päringute visualiseerimiseks ning veebilehitsejas funktsionaalsuse loomiseks.</w:t>
+        <w:t>ChatGPT</w:t>
+      </w:r>
+      <w:r>
+        <w:t>: Abi saamiseks keerulisemate andmebaasi- ja koodiprobleemide lahendamisel ning juhiste ja nõuannete saamiseks.</w:t>
       </w:r>
     </w:p>
     <w:p>
@@ -619,6 +619,27 @@
           <w:b/>
           <w:bCs/>
         </w:rPr>
+        <w:t>Javascript, HTML ja CSS</w:t>
+      </w:r>
+      <w:r>
+        <w:t>:</w:t>
+      </w:r>
+      <w:r>
+        <w:t xml:space="preserve"> Päringute visualiseerimiseks ning veebilehitsejas funktsionaalsuse loomiseks.</w:t>
+      </w:r>
+    </w:p>
+    <w:p>
+      <w:pPr>
+        <w:numPr>
+          <w:ilvl w:val="1"/>
+          <w:numId w:val="3"/>
+        </w:numPr>
+      </w:pPr>
+      <w:r>
+        <w:rPr>
+          <w:b/>
+          <w:bCs/>
+        </w:rPr>
         <w:t>Github</w:t>
       </w:r>
       <w:r>
@@ -651,7 +672,16 @@
     </w:p>
     <w:p>
       <w:r>
-        <w:t>Projekti käigus saavutasin tugeva arusaama relatsiooniliste andmebaaside ja nende haldamise kohta, samuti nende integreerimisest Django veebirakendusse. Andmebaasi disain ja päringute koostamine olid projekti põhifookuses, pakkudes väärtuslikke õppetunde, mida saan kasutada ka tulevikus. Algsete andmete kogumise ja importimise raskuste tõttu pidin kohanema ja looma dummy dataset-i, mis pakkus siiski võimaluse praktiliselt andmebaasidega töötada. PostgreSQL valimine osutus õigeks otsuseks, kuna see pakkus vajalikku paindlikkust ja funktsionaalsust ning aitas mul paremini mõista relatsiooniliste andmebaaside toimimist.</w:t>
+        <w:t xml:space="preserve">Projekti käigus saavutasin </w:t>
+      </w:r>
+      <w:r>
+        <w:t>parema</w:t>
+      </w:r>
+      <w:r>
+        <w:t xml:space="preserve"> arusaama relatsiooniliste andmebaaside ja nende haldamise kohta, samuti nende integreerimisest Django veebirakendusse. Andmebaasi disain ja päringute koostamine olid projekti põhifookuses, pakkudes väärtuslikke õppetunde, mida saan kasutada ka tulevikus. Algsete andmete kogumise ja importimise raskuste tõttu pidin kohanema ja looma dummy dataset-i, mis pakkus siiski võimaluse praktiliselt andmebaasidega töötada. PostgreSQL valimine osutus õigeks otsuseks, kuna see pakkus vajalikku paindlikkust ja funktsionaalsust ning aitas mul paremini mõista relatsiooniliste andmebaaside toimimist.</w:t>
+      </w:r>
+      <w:r>
+        <w:t xml:space="preserve"> Ühtlasin nägin sellega ka ära vahemälu vajalikkuse ja võimalused selle loomiseks kasutades selleks puhuks eraldi, mitterelatsioonilist andmebaasi, Redis.</w:t>
       </w:r>
     </w:p>
     <w:p/>

</xml_diff>